<commit_message>
Phase 3 offline analyses; script plain-words blocks; paper fixes
- analyse_prototype_direction: matched text moves both prototypes toward the
  image cloud (+0.067), mismatched away (-0.017); reproduces all 8 Table 9 angles
- analyse_within_view: bootstrap CI on the within-view gap; excludes pooled +0.105
- main.tex: suppress empty ORCID/corresponding-author footnote; Avenue rank
  fifth->third and 70.6->67.7 to match tbl:sota
- script: plain-language callout per slide; Avenue cell corrected to 67.7
</commit_message>
<xml_diff>
--- a/docs/06_presentations/DA-ZVAD_Phase2_Script.docx
+++ b/docs/06_presentations/DA-ZVAD_Phase2_Script.docx
@@ -118,6 +118,58 @@
           <w:color w:val="3A4A4C"/>
           <w:sz w:val="21"/>
         </w:rPr>
+        <w:t xml:space="preserve">Every slide also carries an </w:t>
+      </w:r>
+      <w:r>
+        <w:rPr>
+          <w:rFonts w:ascii="Georgia" w:hAnsi="Georgia"/>
+          <w:b/>
+          <w:i w:val="0"/>
+          <w:color w:val="141C1E"/>
+          <w:sz w:val="21"/>
+        </w:rPr>
+        <w:t>In plain words</w:t>
+      </w:r>
+      <w:r>
+        <w:rPr>
+          <w:rFonts w:ascii="Georgia" w:hAnsi="Georgia"/>
+          <w:b w:val="0"/>
+          <w:i w:val="0"/>
+          <w:color w:val="3A4A4C"/>
+          <w:sz w:val="21"/>
+        </w:rPr>
+        <w:t xml:space="preserve"> block in a tinted box. That is the slide explained to somebody who does not work in this field — no notation, no term left undefined, and for the slides that cover something we built, an account of </w:t>
+      </w:r>
+      <w:r>
+        <w:rPr>
+          <w:rFonts w:ascii="Georgia" w:hAnsi="Georgia"/>
+          <w:b w:val="0"/>
+          <w:i/>
+          <w:color w:val="3A4A4C"/>
+          <w:sz w:val="21"/>
+        </w:rPr>
+        <w:t>how</w:t>
+      </w:r>
+      <w:r>
+        <w:rPr>
+          <w:rFonts w:ascii="Georgia" w:hAnsi="Georgia"/>
+          <w:b w:val="0"/>
+          <w:i w:val="0"/>
+          <w:color w:val="3A4A4C"/>
+          <w:sz w:val="21"/>
+        </w:rPr>
+        <w:t xml:space="preserve"> it was built rather than of what it scores. It is written to be said aloud roughly as it stands. Use it as your default register and drop into the technical wording only when a panelist asks for it. A panel that follows you is a panel that asks good questions; a panel that has lost the thread asks whether you wrote this yourself.</w:t>
+      </w:r>
+    </w:p>
+    <w:p>
+      <w:r>
+        <w:rPr>
+          <w:rFonts w:ascii="Georgia" w:hAnsi="Georgia"/>
+          <w:b w:val="0"/>
+          <w:i w:val="0"/>
+          <w:color w:val="3A4A4C"/>
+          <w:sz w:val="21"/>
+        </w:rPr>
         <w:t xml:space="preserve">Each slide ends with a </w:t>
       </w:r>
       <w:r>
@@ -294,6 +346,35 @@
       </w:r>
     </w:p>
     <w:p>
+      <w:pPr>
+        <w:spacing w:before="120" w:after="120"/>
+        <w:ind w:left="317"/>
+        <w:pBdr>
+          <w:left w:val="single" w:sz="18" w:space="10" w:color="0D6B67"/>
+        </w:pBdr>
+      </w:pPr>
+      <w:r>
+        <w:rPr>
+          <w:rFonts w:ascii="Georgia" w:hAnsi="Georgia"/>
+          <w:b/>
+          <w:i w:val="0"/>
+          <w:color w:val="141C1E"/>
+          <w:sz w:val="21"/>
+        </w:rPr>
+        <w:t>In plain words.</w:t>
+      </w:r>
+      <w:r>
+        <w:rPr>
+          <w:rFonts w:ascii="Georgia" w:hAnsi="Georgia"/>
+          <w:b w:val="0"/>
+          <w:i w:val="0"/>
+          <w:color w:val="141C1E"/>
+          <w:sz w:val="21"/>
+        </w:rPr>
+        <w:t xml:space="preserve"> A security camera system that spots unusual events has to be taught what "usual" looks like at that particular camera, using weeks of its own footage. Move it to a new place and you start over. What I built lets you move it by typing one sentence describing the new place. Nothing is retrained — and part of the talk is about the version of this that failed before it worked.</w:t>
+      </w:r>
+    </w:p>
+    <w:p>
       <w:r>
         <w:rPr>
           <w:rFonts w:ascii="Georgia" w:hAnsi="Georgia"/>
@@ -422,6 +503,55 @@
       </w:r>
     </w:p>
     <w:p>
+      <w:pPr>
+        <w:spacing w:before="120" w:after="120"/>
+        <w:ind w:left="317"/>
+        <w:pBdr>
+          <w:left w:val="single" w:sz="18" w:space="10" w:color="0D6B67"/>
+        </w:pBdr>
+      </w:pPr>
+      <w:r>
+        <w:rPr>
+          <w:rFonts w:ascii="Georgia" w:hAnsi="Georgia"/>
+          <w:b/>
+          <w:i w:val="0"/>
+          <w:color w:val="141C1E"/>
+          <w:sz w:val="21"/>
+        </w:rPr>
+        <w:t>In plain words.</w:t>
+      </w:r>
+      <w:r>
+        <w:rPr>
+          <w:rFonts w:ascii="Georgia" w:hAnsi="Georgia"/>
+          <w:b w:val="0"/>
+          <w:i w:val="0"/>
+          <w:color w:val="141C1E"/>
+          <w:sz w:val="21"/>
+        </w:rPr>
+        <w:t xml:space="preserve"> The reason you cannot just copy a detector from one site to another is not that the new camera looks different. It is that the </w:t>
+      </w:r>
+      <w:r>
+        <w:rPr>
+          <w:rFonts w:ascii="Georgia" w:hAnsi="Georgia"/>
+          <w:b w:val="0"/>
+          <w:i/>
+          <w:color w:val="141C1E"/>
+          <w:sz w:val="21"/>
+        </w:rPr>
+        <w:t>rule</w:t>
+      </w:r>
+      <w:r>
+        <w:rPr>
+          <w:rFonts w:ascii="Georgia" w:hAnsi="Georgia"/>
+          <w:b w:val="0"/>
+          <w:i w:val="0"/>
+          <w:color w:val="141C1E"/>
+          <w:sz w:val="21"/>
+        </w:rPr>
+        <w:t xml:space="preserve"> is different. A forklift is an emergency in a shopping mall and completely ordinary in a warehouse — and no amount of adjusting for lighting or camera angle will ever tell you which building you are in.</w:t>
+      </w:r>
+    </w:p>
+    <w:p>
       <w:r>
         <w:rPr>
           <w:rFonts w:ascii="Georgia" w:hAnsi="Georgia"/>
@@ -562,6 +692,35 @@
       </w:r>
     </w:p>
     <w:p>
+      <w:pPr>
+        <w:spacing w:before="120" w:after="120"/>
+        <w:ind w:left="317"/>
+        <w:pBdr>
+          <w:left w:val="single" w:sz="18" w:space="10" w:color="0D6B67"/>
+        </w:pBdr>
+      </w:pPr>
+      <w:r>
+        <w:rPr>
+          <w:rFonts w:ascii="Georgia" w:hAnsi="Georgia"/>
+          <w:b/>
+          <w:i w:val="0"/>
+          <w:color w:val="141C1E"/>
+          <w:sz w:val="21"/>
+        </w:rPr>
+        <w:t>In plain words.</w:t>
+      </w:r>
+      <w:r>
+        <w:rPr>
+          <w:rFonts w:ascii="Georgia" w:hAnsi="Georgia"/>
+          <w:b w:val="0"/>
+          <w:i w:val="0"/>
+          <w:color w:val="141C1E"/>
+          <w:sz w:val="21"/>
+        </w:rPr>
+        <w:t xml:space="preserve"> When researchers talk about moving a model to a new place, they almost always mean the pictures look different — fog instead of sunshine. They say openly that they are setting aside the other case, where the picture is the same and the correct answer changes. For recognising objects that is a sensible thing to set aside. For anomaly detection it is the entire problem.</w:t>
+      </w:r>
+    </w:p>
+    <w:p>
       <w:r>
         <w:rPr>
           <w:rFonts w:ascii="Georgia" w:hAnsi="Georgia"/>
@@ -817,6 +976,35 @@
           <w:sz w:val="21"/>
         </w:rPr>
         <w:t xml:space="preserve"> the deployment context.</w:t>
+      </w:r>
+    </w:p>
+    <w:p>
+      <w:pPr>
+        <w:spacing w:before="120" w:after="120"/>
+        <w:ind w:left="317"/>
+        <w:pBdr>
+          <w:left w:val="single" w:sz="18" w:space="10" w:color="0D6B67"/>
+        </w:pBdr>
+      </w:pPr>
+      <w:r>
+        <w:rPr>
+          <w:rFonts w:ascii="Georgia" w:hAnsi="Georgia"/>
+          <w:b/>
+          <w:i w:val="0"/>
+          <w:color w:val="141C1E"/>
+          <w:sz w:val="21"/>
+        </w:rPr>
+        <w:t>In plain words.</w:t>
+      </w:r>
+      <w:r>
+        <w:rPr>
+          <w:rFonts w:ascii="Georgia" w:hAnsi="Georgia"/>
+          <w:b w:val="0"/>
+          <w:i w:val="0"/>
+          <w:color w:val="141C1E"/>
+          <w:sz w:val="21"/>
+        </w:rPr>
+        <w:t xml:space="preserve"> In this task "normal" is not a property of the object, it is a property of the place. So the thing the field set aside is the thing I am left holding. That is the gap: not that anyone was careless, but that the tools were built for a different kind of difference than the one anomaly detection has.</w:t>
       </w:r>
     </w:p>
     <w:p>
@@ -1050,6 +1238,35 @@
           <w:sz w:val="25"/>
         </w:rPr>
         <w:t>The thirty-second version, if you get cut short</w:t>
+      </w:r>
+    </w:p>
+    <w:p>
+      <w:pPr>
+        <w:spacing w:before="120" w:after="120"/>
+        <w:ind w:left="317"/>
+        <w:pBdr>
+          <w:left w:val="single" w:sz="18" w:space="10" w:color="0D6B67"/>
+        </w:pBdr>
+      </w:pPr>
+      <w:r>
+        <w:rPr>
+          <w:rFonts w:ascii="Georgia" w:hAnsi="Georgia"/>
+          <w:b/>
+          <w:i w:val="0"/>
+          <w:color w:val="141C1E"/>
+          <w:sz w:val="21"/>
+        </w:rPr>
+        <w:t>In plain words, before any of the boxes.</w:t>
+      </w:r>
+      <w:r>
+        <w:rPr>
+          <w:rFonts w:ascii="Georgia" w:hAnsi="Georgia"/>
+          <w:b w:val="0"/>
+          <w:i w:val="0"/>
+          <w:color w:val="141C1E"/>
+          <w:sz w:val="21"/>
+        </w:rPr>
+        <w:t xml:space="preserve"> Video comes in on the left. A person types one sentence about where the camera is. Both go through models that were already trained by somebody else and that I never modify. They meet in the middle, where each frame gets a score for how much it looks like the written description of "something wrong" rather than the written description of "an ordinary day here". That score is smoothed over about a second, and anything that stays high gets flagged and described in words. To move this to a new building, you edit the sentence. That is the entire deployment procedure.</w:t>
       </w:r>
     </w:p>
     <w:p>
@@ -1156,6 +1373,55 @@
       </w:r>
     </w:p>
     <w:p>
+      <w:pPr>
+        <w:spacing w:before="120" w:after="120"/>
+        <w:ind w:left="317"/>
+        <w:pBdr>
+          <w:left w:val="single" w:sz="18" w:space="10" w:color="0D6B67"/>
+        </w:pBdr>
+      </w:pPr>
+      <w:r>
+        <w:rPr>
+          <w:rFonts w:ascii="Georgia" w:hAnsi="Georgia"/>
+          <w:b/>
+          <w:i w:val="0"/>
+          <w:color w:val="141C1E"/>
+          <w:sz w:val="21"/>
+        </w:rPr>
+        <w:t>In plain words.</w:t>
+      </w:r>
+      <w:r>
+        <w:rPr>
+          <w:rFonts w:ascii="Georgia" w:hAnsi="Georgia"/>
+          <w:b w:val="0"/>
+          <w:i w:val="0"/>
+          <w:color w:val="141C1E"/>
+          <w:sz w:val="21"/>
+        </w:rPr>
+        <w:t xml:space="preserve"> Two arrows come in, not one, and that is deliberate. The camera supplies pictures. A </w:t>
+      </w:r>
+      <w:r>
+        <w:rPr>
+          <w:rFonts w:ascii="Georgia" w:hAnsi="Georgia"/>
+          <w:b w:val="0"/>
+          <w:i/>
+          <w:color w:val="141C1E"/>
+          <w:sz w:val="21"/>
+        </w:rPr>
+        <w:t>person</w:t>
+      </w:r>
+      <w:r>
+        <w:rPr>
+          <w:rFonts w:ascii="Georgia" w:hAnsi="Georgia"/>
+          <w:b w:val="0"/>
+          <w:i w:val="0"/>
+          <w:color w:val="141C1E"/>
+          <w:sz w:val="21"/>
+        </w:rPr>
+        <w:t xml:space="preserve"> supplies the place, by typing a sentence. If I had drawn one arrow feeding both branches it would suggest the system works out the location from the video by itself — it does not, and that separation is the whole method.</w:t>
+      </w:r>
+    </w:p>
+    <w:p>
       <w:r>
         <w:rPr>
           <w:rFonts w:ascii="Georgia" w:hAnsi="Georgia"/>
@@ -1300,6 +1566,35 @@
       </w:r>
     </w:p>
     <w:p>
+      <w:pPr>
+        <w:spacing w:before="120" w:after="120"/>
+        <w:ind w:left="317"/>
+        <w:pBdr>
+          <w:left w:val="single" w:sz="18" w:space="10" w:color="0D6B67"/>
+        </w:pBdr>
+      </w:pPr>
+      <w:r>
+        <w:rPr>
+          <w:rFonts w:ascii="Georgia" w:hAnsi="Georgia"/>
+          <w:b/>
+          <w:i w:val="0"/>
+          <w:color w:val="141C1E"/>
+          <w:sz w:val="21"/>
+        </w:rPr>
+        <w:t>In plain words.</w:t>
+      </w:r>
+      <w:r>
+        <w:rPr>
+          <w:rFonts w:ascii="Georgia" w:hAnsi="Georgia"/>
+          <w:b w:val="0"/>
+          <w:i w:val="0"/>
+          <w:color w:val="141C1E"/>
+          <w:sz w:val="21"/>
+        </w:rPr>
+        <w:t xml:space="preserve"> How this part was built: I did not build it. It is an off-the-shelf model called CLIP, which somebody trained on hundreds of millions of pictures paired with their captions. Because of that training it puts a photograph and a sentence describing that photograph in the same place. I use it exactly as shipped — I feed it a frame, and it hands back a list of 768 numbers standing for what is in that frame. The snowflake means I never touch its settings.</w:t>
+      </w:r>
+    </w:p>
+    <w:p>
       <w:r>
         <w:rPr>
           <w:rFonts w:ascii="Georgia" w:hAnsi="Georgia"/>
@@ -1362,6 +1657,55 @@
       </w:r>
     </w:p>
     <w:p>
+      <w:pPr>
+        <w:spacing w:before="120" w:after="120"/>
+        <w:ind w:left="317"/>
+        <w:pBdr>
+          <w:left w:val="single" w:sz="18" w:space="10" w:color="0D6B67"/>
+        </w:pBdr>
+      </w:pPr>
+      <w:r>
+        <w:rPr>
+          <w:rFonts w:ascii="Georgia" w:hAnsi="Georgia"/>
+          <w:b/>
+          <w:i w:val="0"/>
+          <w:color w:val="141C1E"/>
+          <w:sz w:val="21"/>
+        </w:rPr>
+        <w:t>In plain words.</w:t>
+      </w:r>
+      <w:r>
+        <w:rPr>
+          <w:rFonts w:ascii="Georgia" w:hAnsi="Georgia"/>
+          <w:b w:val="0"/>
+          <w:i w:val="0"/>
+          <w:color w:val="141C1E"/>
+          <w:sz w:val="21"/>
+        </w:rPr>
+        <w:t xml:space="preserve"> This is the part I actually built, so let me go slowly. I keep two short lists of phrases: things you would write about a normal scene, and things you would write about an alarming one. The operator's sentence — "a campus walkway with pedestrians" — gets pasted onto the ends of the </w:t>
+      </w:r>
+      <w:r>
+        <w:rPr>
+          <w:rFonts w:ascii="Georgia" w:hAnsi="Georgia"/>
+          <w:b w:val="0"/>
+          <w:i/>
+          <w:color w:val="141C1E"/>
+          <w:sz w:val="21"/>
+        </w:rPr>
+        <w:t>normal</w:t>
+      </w:r>
+      <w:r>
+        <w:rPr>
+          <w:rFonts w:ascii="Georgia" w:hAnsi="Georgia"/>
+          <w:b w:val="0"/>
+          <w:i w:val="0"/>
+          <w:color w:val="141C1E"/>
+          <w:sz w:val="21"/>
+        </w:rPr>
+        <w:t xml:space="preserve"> list only. Each list is then run through the same off-the-shelf model and averaged down to a single summary. So I end up with two reference points: one meaning "normal here", one meaning "abnormal". Pasting the sentence onto one side rather than both is one line of code, and it is the difference between the method working and the method inverting. I will show you that in about ten minutes.</w:t>
+      </w:r>
+    </w:p>
+    <w:p>
       <w:r>
         <w:rPr>
           <w:rFonts w:ascii="Georgia" w:hAnsi="Georgia"/>
@@ -1652,6 +1996,55 @@
       </w:r>
     </w:p>
     <w:p>
+      <w:pPr>
+        <w:spacing w:before="120" w:after="120"/>
+        <w:ind w:left="317"/>
+        <w:pBdr>
+          <w:left w:val="single" w:sz="18" w:space="10" w:color="0D6B67"/>
+        </w:pBdr>
+      </w:pPr>
+      <w:r>
+        <w:rPr>
+          <w:rFonts w:ascii="Georgia" w:hAnsi="Georgia"/>
+          <w:b/>
+          <w:i w:val="0"/>
+          <w:color w:val="141C1E"/>
+          <w:sz w:val="21"/>
+        </w:rPr>
+        <w:t>In plain words.</w:t>
+      </w:r>
+      <w:r>
+        <w:rPr>
+          <w:rFonts w:ascii="Georgia" w:hAnsi="Georgia"/>
+          <w:b w:val="0"/>
+          <w:i w:val="0"/>
+          <w:color w:val="141C1E"/>
+          <w:sz w:val="21"/>
+        </w:rPr>
+        <w:t xml:space="preserve"> Now the two branches meet. I have a frame as numbers, and two reference points as numbers. I measure which of the two the frame is closer to, and turn that into a value between 0 and 1. There is no classifier here that I trained — the entire decision is which of the two written descriptions the picture resembles more. And I should be precise about what the number means: it is </w:t>
+      </w:r>
+      <w:r>
+        <w:rPr>
+          <w:rFonts w:ascii="Georgia" w:hAnsi="Georgia"/>
+          <w:b w:val="0"/>
+          <w:i/>
+          <w:color w:val="141C1E"/>
+          <w:sz w:val="21"/>
+        </w:rPr>
+        <w:t>how much more</w:t>
+      </w:r>
+      <w:r>
+        <w:rPr>
+          <w:rFonts w:ascii="Georgia" w:hAnsi="Georgia"/>
+          <w:b w:val="0"/>
+          <w:i w:val="0"/>
+          <w:color w:val="141C1E"/>
+          <w:sz w:val="21"/>
+        </w:rPr>
+        <w:t xml:space="preserve"> abnormal than normal the frame reads, not the probability that something bad is happening.</w:t>
+      </w:r>
+    </w:p>
+    <w:p>
       <w:r>
         <w:rPr>
           <w:rFonts w:ascii="Georgia" w:hAnsi="Georgia"/>
@@ -1808,6 +2201,35 @@
       </w:r>
     </w:p>
     <w:p>
+      <w:pPr>
+        <w:spacing w:before="120" w:after="120"/>
+        <w:ind w:left="317"/>
+        <w:pBdr>
+          <w:left w:val="single" w:sz="18" w:space="10" w:color="0D6B67"/>
+        </w:pBdr>
+      </w:pPr>
+      <w:r>
+        <w:rPr>
+          <w:rFonts w:ascii="Georgia" w:hAnsi="Georgia"/>
+          <w:b/>
+          <w:i w:val="0"/>
+          <w:color w:val="141C1E"/>
+          <w:sz w:val="21"/>
+        </w:rPr>
+        <w:t>In plain words.</w:t>
+      </w:r>
+      <w:r>
+        <w:rPr>
+          <w:rFonts w:ascii="Georgia" w:hAnsi="Georgia"/>
+          <w:b w:val="0"/>
+          <w:i w:val="0"/>
+          <w:color w:val="141C1E"/>
+          <w:sz w:val="21"/>
+        </w:rPr>
+        <w:t xml:space="preserve"> Frame-by-frame scores jump around. So I replace each frame's score with the average of it and the fifteen frames either side — about a second in each direction. One freak frame can no longer raise an alarm, but a real event lasting a couple of seconds still stands out clearly. There is nothing learned in this step at all; it is an average. The little plot inside the box shows it: thin grey is before, thick blue is after, the shaded band is the real event.</w:t>
+      </w:r>
+    </w:p>
+    <w:p>
       <w:r>
         <w:rPr>
           <w:rFonts w:ascii="Georgia" w:hAnsi="Georgia"/>
@@ -1879,6 +2301,35 @@
           <w:sz w:val="25"/>
         </w:rPr>
         <w:t>Stop 6 — M4, detection and explanation</w:t>
+      </w:r>
+    </w:p>
+    <w:p>
+      <w:pPr>
+        <w:spacing w:before="120" w:after="120"/>
+        <w:ind w:left="317"/>
+        <w:pBdr>
+          <w:left w:val="single" w:sz="18" w:space="10" w:color="0D6B67"/>
+        </w:pBdr>
+      </w:pPr>
+      <w:r>
+        <w:rPr>
+          <w:rFonts w:ascii="Georgia" w:hAnsi="Georgia"/>
+          <w:b/>
+          <w:i w:val="0"/>
+          <w:color w:val="141C1E"/>
+          <w:sz w:val="21"/>
+        </w:rPr>
+        <w:t>In plain words.</w:t>
+      </w:r>
+      <w:r>
+        <w:rPr>
+          <w:rFonts w:ascii="Georgia" w:hAnsi="Georgia"/>
+          <w:b w:val="0"/>
+          <w:i w:val="0"/>
+          <w:color w:val="141C1E"/>
+          <w:sz w:val="21"/>
+        </w:rPr>
+        <w:t xml:space="preserve"> Once a stretch of frames crosses the threshold, I pick the single worst frame from that stretch and hand it — along with the same operator sentence — to a second off-the-shelf model that can look at a picture and write about it. Only one frame per event, so the expensive part runs a handful of times per video rather than thousands. I should say plainly that this part is built and runs, but has not produced video results yet. It is the first thing on the Phase 3 list.</w:t>
       </w:r>
     </w:p>
     <w:p>
@@ -2399,6 +2850,35 @@
       </w:r>
     </w:p>
     <w:p>
+      <w:pPr>
+        <w:spacing w:before="120" w:after="120"/>
+        <w:ind w:left="317"/>
+        <w:pBdr>
+          <w:left w:val="single" w:sz="18" w:space="10" w:color="0D6B67"/>
+        </w:pBdr>
+      </w:pPr>
+      <w:r>
+        <w:rPr>
+          <w:rFonts w:ascii="Georgia" w:hAnsi="Georgia"/>
+          <w:b/>
+          <w:i w:val="0"/>
+          <w:color w:val="141C1E"/>
+          <w:sz w:val="21"/>
+        </w:rPr>
+        <w:t>In plain words.</w:t>
+      </w:r>
+      <w:r>
+        <w:rPr>
+          <w:rFonts w:ascii="Georgia" w:hAnsi="Georgia"/>
+          <w:b w:val="0"/>
+          <w:i w:val="0"/>
+          <w:color w:val="141C1E"/>
+          <w:sz w:val="21"/>
+        </w:rPr>
+        <w:t xml:space="preserve"> Here is the reason nothing in the system is allowed to learn. If any part of it adapted to the new site on its own and the numbers went up, I could never say whether the sentence did it or the learning did. By bolting everything down, I leave exactly one thing free to change. Then if the number moves, there is only one thing that could have moved it. That is not me being frugal with GPU time — it is the only way to make the claim checkable.</w:t>
+      </w:r>
+    </w:p>
+    <w:p>
       <w:r>
         <w:rPr>
           <w:rFonts w:ascii="Georgia" w:hAnsi="Georgia"/>
@@ -2659,6 +3139,35 @@
       </w:r>
     </w:p>
     <w:p>
+      <w:pPr>
+        <w:spacing w:before="120" w:after="120"/>
+        <w:ind w:left="317"/>
+        <w:pBdr>
+          <w:left w:val="single" w:sz="18" w:space="10" w:color="0D6B67"/>
+        </w:pBdr>
+      </w:pPr>
+      <w:r>
+        <w:rPr>
+          <w:rFonts w:ascii="Georgia" w:hAnsi="Georgia"/>
+          <w:b/>
+          <w:i w:val="0"/>
+          <w:color w:val="141C1E"/>
+          <w:sz w:val="21"/>
+        </w:rPr>
+        <w:t>In plain words.</w:t>
+      </w:r>
+      <w:r>
+        <w:rPr>
+          <w:rFonts w:ascii="Georgia" w:hAnsi="Georgia"/>
+          <w:b w:val="0"/>
+          <w:i w:val="0"/>
+          <w:color w:val="141C1E"/>
+          <w:sz w:val="21"/>
+        </w:rPr>
+        <w:t xml:space="preserve"> How I built the test: run the whole system four times over the identical video, changing nothing but the sentence. Once with no sentence. Once with a meaningless one. Once with a correct description. And once with a description of somewhere else entirely. That last run is the important one — if feeding the system a deliberately wrong description costs it nothing, then it was never reading the sentence and my whole idea is wrong. I wrote down what each outcome would mean before I ran any of them.</w:t>
+      </w:r>
+    </w:p>
+    <w:p>
       <w:r>
         <w:rPr>
           <w:rFonts w:ascii="Georgia" w:hAnsi="Georgia"/>
@@ -2827,6 +3336,35 @@
       </w:r>
     </w:p>
     <w:p>
+      <w:pPr>
+        <w:spacing w:before="120" w:after="120"/>
+        <w:ind w:left="317"/>
+        <w:pBdr>
+          <w:left w:val="single" w:sz="18" w:space="10" w:color="0D6B67"/>
+        </w:pBdr>
+      </w:pPr>
+      <w:r>
+        <w:rPr>
+          <w:rFonts w:ascii="Georgia" w:hAnsi="Georgia"/>
+          <w:b/>
+          <w:i w:val="0"/>
+          <w:color w:val="141C1E"/>
+          <w:sz w:val="21"/>
+        </w:rPr>
+        <w:t>In plain words.</w:t>
+      </w:r>
+      <w:r>
+        <w:rPr>
+          <w:rFonts w:ascii="Georgia" w:hAnsi="Georgia"/>
+          <w:b w:val="0"/>
+          <w:i w:val="0"/>
+          <w:color w:val="141C1E"/>
+          <w:sz w:val="21"/>
+        </w:rPr>
+        <w:t xml:space="preserve"> Every time a run finishes, the code automatically writes a small record beside the results: which version of the code ran, on which machine and graphics card, with which library versions, and how many frames and labels it actually saw. I did not do that by hand afterwards. It means any number in this talk can be traced back to the exact state of the project that produced it.</w:t>
+      </w:r>
+    </w:p>
+    <w:p>
       <w:r>
         <w:rPr>
           <w:rFonts w:ascii="Georgia" w:hAnsi="Georgia"/>
@@ -2962,6 +3500,35 @@
           <w:sz w:val="21"/>
         </w:rPr>
         <w:t xml:space="preserve"> the concept-shift argument, as a photograph.</w:t>
+      </w:r>
+    </w:p>
+    <w:p>
+      <w:pPr>
+        <w:spacing w:before="120" w:after="120"/>
+        <w:ind w:left="317"/>
+        <w:pBdr>
+          <w:left w:val="single" w:sz="18" w:space="10" w:color="0D6B67"/>
+        </w:pBdr>
+      </w:pPr>
+      <w:r>
+        <w:rPr>
+          <w:rFonts w:ascii="Georgia" w:hAnsi="Georgia"/>
+          <w:b/>
+          <w:i w:val="0"/>
+          <w:color w:val="141C1E"/>
+          <w:sz w:val="21"/>
+        </w:rPr>
+        <w:t>In plain words.</w:t>
+      </w:r>
+      <w:r>
+        <w:rPr>
+          <w:rFonts w:ascii="Georgia" w:hAnsi="Georgia"/>
+          <w:b w:val="0"/>
+          <w:i w:val="0"/>
+          <w:color w:val="141C1E"/>
+          <w:sz w:val="21"/>
+        </w:rPr>
+        <w:t xml:space="preserve"> Look down any one column. It is the same camera, same angle, same lighting, in both pictures. The only thing that changes is what is happening in the frame — and the label flips from normal to anomalous. That is the whole argument of the first four slides, sitting in a photograph.</w:t>
       </w:r>
     </w:p>
     <w:p>
@@ -3198,6 +3765,35 @@
       </w:r>
     </w:p>
     <w:p>
+      <w:pPr>
+        <w:spacing w:before="120" w:after="120"/>
+        <w:ind w:left="317"/>
+        <w:pBdr>
+          <w:left w:val="single" w:sz="18" w:space="10" w:color="0D6B67"/>
+        </w:pBdr>
+      </w:pPr>
+      <w:r>
+        <w:rPr>
+          <w:rFonts w:ascii="Georgia" w:hAnsi="Georgia"/>
+          <w:b/>
+          <w:i w:val="0"/>
+          <w:color w:val="141C1E"/>
+          <w:sz w:val="21"/>
+        </w:rPr>
+        <w:t>In plain words.</w:t>
+      </w:r>
+      <w:r>
+        <w:rPr>
+          <w:rFonts w:ascii="Georgia" w:hAnsi="Georgia"/>
+          <w:b w:val="0"/>
+          <w:i w:val="0"/>
+          <w:color w:val="141C1E"/>
+          <w:sz w:val="21"/>
+        </w:rPr>
+        <w:t xml:space="preserve"> The first complete run came back at 0.49. Half. A coin flip would have done as well. And the central experiment came out backwards: the correct description performed worse than the deliberately wrong one. I want to show you this rather than skip to the version that works, because everything useful in the project came out of taking it apart.</w:t>
+      </w:r>
+    </w:p>
+    <w:p>
       <w:r>
         <w:rPr>
           <w:rFonts w:ascii="Georgia" w:hAnsi="Georgia"/>
@@ -3428,6 +4024,35 @@
       </w:r>
     </w:p>
     <w:p>
+      <w:pPr>
+        <w:spacing w:before="120" w:after="120"/>
+        <w:ind w:left="317"/>
+        <w:pBdr>
+          <w:left w:val="single" w:sz="18" w:space="10" w:color="0D6B67"/>
+        </w:pBdr>
+      </w:pPr>
+      <w:r>
+        <w:rPr>
+          <w:rFonts w:ascii="Georgia" w:hAnsi="Georgia"/>
+          <w:b/>
+          <w:i w:val="0"/>
+          <w:color w:val="141C1E"/>
+          <w:sz w:val="21"/>
+        </w:rPr>
+        <w:t>In plain words.</w:t>
+      </w:r>
+      <w:r>
+        <w:rPr>
+          <w:rFonts w:ascii="Georgia" w:hAnsi="Georgia"/>
+          <w:b w:val="0"/>
+          <w:i w:val="0"/>
+          <w:color w:val="141C1E"/>
+          <w:sz w:val="21"/>
+        </w:rPr>
+        <w:t xml:space="preserve"> The first problem had nothing to do with my idea. This dataset has twelve different cameras, and the model naturally scores some cameras higher than others simply because of how they look. I had thrown every frame from all twelve cameras into one big pile and ranked them together. It is like ranking students from twelve schools on raw marks when the schools mark to different standards — you destroy the ordering that was correct inside each school. Ranking within each clip first, then combining, took the same scores from 0.49 to 0.71. No labels involved, and it is the dataset's own published procedure. I simply had not been following it.</w:t>
+      </w:r>
+    </w:p>
+    <w:p>
       <w:r>
         <w:rPr>
           <w:rFonts w:ascii="Georgia" w:hAnsi="Georgia"/>
@@ -3647,6 +4272,35 @@
           <w:sz w:val="21"/>
         </w:rPr>
         <w:t xml:space="preserve"> the diagnosis was not invented after the fact.</w:t>
+      </w:r>
+    </w:p>
+    <w:p>
+      <w:pPr>
+        <w:spacing w:before="120" w:after="120"/>
+        <w:ind w:left="317"/>
+        <w:pBdr>
+          <w:left w:val="single" w:sz="18" w:space="10" w:color="0D6B67"/>
+        </w:pBdr>
+      </w:pPr>
+      <w:r>
+        <w:rPr>
+          <w:rFonts w:ascii="Georgia" w:hAnsi="Georgia"/>
+          <w:b/>
+          <w:i w:val="0"/>
+          <w:color w:val="141C1E"/>
+          <w:sz w:val="21"/>
+        </w:rPr>
+        <w:t>In plain words.</w:t>
+      </w:r>
+      <w:r>
+        <w:rPr>
+          <w:rFonts w:ascii="Georgia" w:hAnsi="Georgia"/>
+          <w:b w:val="0"/>
+          <w:i w:val="0"/>
+          <w:color w:val="141C1E"/>
+          <w:sz w:val="21"/>
+        </w:rPr>
+        <w:t xml:space="preserve"> I did not want to just assert that explanation, so here is the check. I took every frame, flattened it onto a two-dimensional map, and coloured each point by which camera it came from. The cameras land in separate clumps. Neither picture uses the answer key at all, so this is not me rationalising after the fact — it is the cause, visible directly.</w:t>
       </w:r>
     </w:p>
     <w:p>
@@ -3871,6 +4525,75 @@
       </w:r>
     </w:p>
     <w:p>
+      <w:pPr>
+        <w:spacing w:before="120" w:after="120"/>
+        <w:ind w:left="317"/>
+        <w:pBdr>
+          <w:left w:val="single" w:sz="18" w:space="10" w:color="0D6B67"/>
+        </w:pBdr>
+      </w:pPr>
+      <w:r>
+        <w:rPr>
+          <w:rFonts w:ascii="Georgia" w:hAnsi="Georgia"/>
+          <w:b/>
+          <w:i w:val="0"/>
+          <w:color w:val="141C1E"/>
+          <w:sz w:val="21"/>
+        </w:rPr>
+        <w:t>In plain words.</w:t>
+      </w:r>
+      <w:r>
+        <w:rPr>
+          <w:rFonts w:ascii="Georgia" w:hAnsi="Georgia"/>
+          <w:b w:val="0"/>
+          <w:i w:val="0"/>
+          <w:color w:val="141C1E"/>
+          <w:sz w:val="21"/>
+        </w:rPr>
+        <w:t xml:space="preserve"> The second problem was mine, and it is the interesting one. The system compares each frame against two written descriptions: one of normal, one of abnormal. I had been pasting the scene sentence onto </w:t>
+      </w:r>
+      <w:r>
+        <w:rPr>
+          <w:rFonts w:ascii="Georgia" w:hAnsi="Georgia"/>
+          <w:b w:val="0"/>
+          <w:i/>
+          <w:color w:val="141C1E"/>
+          <w:sz w:val="21"/>
+        </w:rPr>
+        <w:t>both</w:t>
+      </w:r>
+      <w:r>
+        <w:rPr>
+          <w:rFonts w:ascii="Georgia" w:hAnsi="Georgia"/>
+          <w:b w:val="0"/>
+          <w:i w:val="0"/>
+          <w:color w:val="141C1E"/>
+          <w:sz w:val="21"/>
+        </w:rPr>
+        <w:t xml:space="preserve"> of them. Each side gets averaged into a single summary, so the same words landed on both sides and the two summaries drifted toward each other — and the whole method depends on them being far apart. I was rubbing out the very contrast I was measuring. Worse: an accurate sentence matches everything on screen, so it does the </w:t>
+      </w:r>
+      <w:r>
+        <w:rPr>
+          <w:rFonts w:ascii="Georgia" w:hAnsi="Georgia"/>
+          <w:b w:val="0"/>
+          <w:i/>
+          <w:color w:val="141C1E"/>
+          <w:sz w:val="21"/>
+        </w:rPr>
+        <w:t>most</w:t>
+      </w:r>
+      <w:r>
+        <w:rPr>
+          <w:rFonts w:ascii="Georgia" w:hAnsi="Georgia"/>
+          <w:b w:val="0"/>
+          <w:i w:val="0"/>
+          <w:color w:val="141C1E"/>
+          <w:sz w:val="21"/>
+        </w:rPr>
+        <w:t xml:space="preserve"> damage. That is exactly why the better sentence scored worse. The fix was one line -- attach the sentence to the "normal" side only, because the scene is what defines normal here and an anomaly is a departure from it.</w:t>
+      </w:r>
+    </w:p>
+    <w:p>
       <w:r>
         <w:rPr>
           <w:rFonts w:ascii="Georgia" w:hAnsi="Georgia"/>
@@ -4142,6 +4865,35 @@
           <w:sz w:val="21"/>
         </w:rPr>
         <w:t xml:space="preserve"> the headline number, and the control that makes it mean something.</w:t>
+      </w:r>
+    </w:p>
+    <w:p>
+      <w:pPr>
+        <w:spacing w:before="120" w:after="120"/>
+        <w:ind w:left="317"/>
+        <w:pBdr>
+          <w:left w:val="single" w:sz="18" w:space="10" w:color="0D6B67"/>
+        </w:pBdr>
+      </w:pPr>
+      <w:r>
+        <w:rPr>
+          <w:rFonts w:ascii="Georgia" w:hAnsi="Georgia"/>
+          <w:b/>
+          <w:i w:val="0"/>
+          <w:color w:val="141C1E"/>
+          <w:sz w:val="21"/>
+        </w:rPr>
+        <w:t>In plain words.</w:t>
+      </w:r>
+      <w:r>
+        <w:rPr>
+          <w:rFonts w:ascii="Georgia" w:hAnsi="Georgia"/>
+          <w:b w:val="0"/>
+          <w:i w:val="0"/>
+          <w:color w:val="141C1E"/>
+          <w:sz w:val="21"/>
+        </w:rPr>
+        <w:t xml:space="preserve"> Same models, same video, same everything — the only two things that vary are which sentence is supplied and which side it is attached to. Start with the first column, where no sentence is supplied at all: 0.707 in both rows. It has to be identical, because with no sentence there is nothing to attach anywhere. That column is my proof that nothing else changed between the two rows. Then look at 0.628: that is what a wrong sentence costs. Ten points, with nothing else in the system permitted to move.</w:t>
       </w:r>
     </w:p>
     <w:p>
@@ -4741,6 +5493,55 @@
     </w:p>
     <w:p>
       <w:pPr>
+        <w:spacing w:before="120" w:after="120"/>
+        <w:ind w:left="317"/>
+        <w:pBdr>
+          <w:left w:val="single" w:sz="18" w:space="10" w:color="0D6B67"/>
+        </w:pBdr>
+      </w:pPr>
+      <w:r>
+        <w:rPr>
+          <w:rFonts w:ascii="Georgia" w:hAnsi="Georgia"/>
+          <w:b/>
+          <w:i w:val="0"/>
+          <w:color w:val="141C1E"/>
+          <w:sz w:val="21"/>
+        </w:rPr>
+        <w:t>In plain words.</w:t>
+      </w:r>
+      <w:r>
+        <w:rPr>
+          <w:rFonts w:ascii="Georgia" w:hAnsi="Georgia"/>
+          <w:b w:val="0"/>
+          <w:i w:val="0"/>
+          <w:color w:val="141C1E"/>
+          <w:sz w:val="21"/>
+        </w:rPr>
+        <w:t xml:space="preserve"> The same numbers as a picture. Do not read the height of any single bar — the thing that matters is the </w:t>
+      </w:r>
+      <w:r>
+        <w:rPr>
+          <w:rFonts w:ascii="Georgia" w:hAnsi="Georgia"/>
+          <w:b w:val="0"/>
+          <w:i/>
+          <w:color w:val="141C1E"/>
+          <w:sz w:val="21"/>
+        </w:rPr>
+        <w:t>distance</w:t>
+      </w:r>
+      <w:r>
+        <w:rPr>
+          <w:rFonts w:ascii="Georgia" w:hAnsi="Georgia"/>
+          <w:b w:val="0"/>
+          <w:i w:val="0"/>
+          <w:color w:val="141C1E"/>
+          <w:sz w:val="21"/>
+        </w:rPr>
+        <w:t xml:space="preserve"> between the matched bar and the mismatched bar. In grey, that distance runs the wrong way. In orange, it runs the right way. The only difference between grey and orange is which side of the comparison the sentence was pasted onto.</w:t>
+      </w:r>
+    </w:p>
+    <w:p>
+      <w:pPr>
         <w:spacing w:before="200" w:after="80"/>
         <w:jc w:val="center"/>
       </w:pPr>
@@ -4942,6 +5743,35 @@
     </w:p>
     <w:p>
       <w:pPr>
+        <w:spacing w:before="120" w:after="120"/>
+        <w:ind w:left="317"/>
+        <w:pBdr>
+          <w:left w:val="single" w:sz="18" w:space="10" w:color="0D6B67"/>
+        </w:pBdr>
+      </w:pPr>
+      <w:r>
+        <w:rPr>
+          <w:rFonts w:ascii="Georgia" w:hAnsi="Georgia"/>
+          <w:b/>
+          <w:i w:val="0"/>
+          <w:color w:val="141C1E"/>
+          <w:sz w:val="21"/>
+        </w:rPr>
+        <w:t>In plain words.</w:t>
+      </w:r>
+      <w:r>
+        <w:rPr>
+          <w:rFonts w:ascii="Georgia" w:hAnsi="Georgia"/>
+          <w:b w:val="0"/>
+          <w:i w:val="0"/>
+          <w:color w:val="141C1E"/>
+          <w:sz w:val="21"/>
+        </w:rPr>
+        <w:t xml:space="preserve"> Everything so far has been an average over a hundred clips. This is one clip. Two lines: the same frozen models scoring the same frames, and the only difference is whether the sentence describes a campus walkway or a factory. Outside the event they sit on top of each other — which is what should happen. Inside the event they separate. There is no averaging here for anyone to argue with.</w:t>
+      </w:r>
+    </w:p>
+    <w:p>
+      <w:pPr>
         <w:spacing w:before="200" w:after="80"/>
         <w:jc w:val="center"/>
       </w:pPr>
@@ -5122,6 +5952,35 @@
       </w:r>
     </w:p>
     <w:p>
+      <w:pPr>
+        <w:spacing w:before="120" w:after="120"/>
+        <w:ind w:left="317"/>
+        <w:pBdr>
+          <w:left w:val="single" w:sz="18" w:space="10" w:color="0D6B67"/>
+        </w:pBdr>
+      </w:pPr>
+      <w:r>
+        <w:rPr>
+          <w:rFonts w:ascii="Georgia" w:hAnsi="Georgia"/>
+          <w:b/>
+          <w:i w:val="0"/>
+          <w:color w:val="141C1E"/>
+          <w:sz w:val="21"/>
+        </w:rPr>
+        <w:t>In plain words.</w:t>
+      </w:r>
+      <w:r>
+        <w:rPr>
+          <w:rFonts w:ascii="Georgia" w:hAnsi="Georgia"/>
+          <w:b w:val="0"/>
+          <w:i w:val="0"/>
+          <w:color w:val="141C1E"/>
+          <w:sz w:val="21"/>
+        </w:rPr>
+        <w:t xml:space="preserve"> I want to split my own result in half, because the two halves are not equally strong. Correct sentence versus no sentence: it helps, but only by about 0.027, and when I reshuffle which clips I test on, the numbers wobble by more than that. So I will say it points the right way and I will not claim the size of it. Wrong sentence versus correct: 0.105, far outside that wobble, and nothing else in the system was free to move. That one I will claim. The honest summary is that the sentence is doing real work, and what proves it is the damage from getting it wrong, not the benefit from getting it right.</w:t>
+      </w:r>
+    </w:p>
+    <w:p>
       <w:r>
         <w:rPr>
           <w:rFonts w:ascii="Georgia" w:hAnsi="Georgia"/>
@@ -5451,6 +6310,35 @@
           <w:sz w:val="21"/>
         </w:rPr>
         <w:t xml:space="preserve"> language alone wins, and a prediction of mine failed.</w:t>
+      </w:r>
+    </w:p>
+    <w:p>
+      <w:pPr>
+        <w:spacing w:before="120" w:after="120"/>
+        <w:ind w:left="317"/>
+        <w:pBdr>
+          <w:left w:val="single" w:sz="18" w:space="10" w:color="0D6B67"/>
+        </w:pBdr>
+      </w:pPr>
+      <w:r>
+        <w:rPr>
+          <w:rFonts w:ascii="Georgia" w:hAnsi="Georgia"/>
+          <w:b/>
+          <w:i w:val="0"/>
+          <w:color w:val="141C1E"/>
+          <w:sz w:val="21"/>
+        </w:rPr>
+        <w:t>In plain words.</w:t>
+      </w:r>
+      <w:r>
+        <w:rPr>
+          <w:rFonts w:ascii="Georgia" w:hAnsi="Georgia"/>
+          <w:b w:val="0"/>
+          <w:i w:val="0"/>
+          <w:color w:val="141C1E"/>
+          <w:sz w:val="21"/>
+        </w:rPr>
+        <w:t xml:space="preserve"> Having got it working, I checked whether every piece I built was actually earning its place. I tried scoring frames by how much they move instead of what they contain, by how far they sit from the clip's own average, and by combinations of those with the language pathway. Language on its own wins. I will point out the one that embarrasses me: I predicted motion would help, because a bicycle at cycling speed is the obvious example of an anomaly you would think needs motion to spot. It added nothing. The image model is evidently already picking up enough of the movement on its own.</w:t>
       </w:r>
     </w:p>
     <w:tbl>
@@ -6029,6 +6917,35 @@
     </w:p>
     <w:p>
       <w:pPr>
+        <w:spacing w:before="120" w:after="120"/>
+        <w:ind w:left="317"/>
+        <w:pBdr>
+          <w:left w:val="single" w:sz="18" w:space="10" w:color="0D6B67"/>
+        </w:pBdr>
+      </w:pPr>
+      <w:r>
+        <w:rPr>
+          <w:rFonts w:ascii="Georgia" w:hAnsi="Georgia"/>
+          <w:b/>
+          <w:i w:val="0"/>
+          <w:color w:val="141C1E"/>
+          <w:sz w:val="21"/>
+        </w:rPr>
+        <w:t>In plain words.</w:t>
+      </w:r>
+      <w:r>
+        <w:rPr>
+          <w:rFonts w:ascii="Georgia" w:hAnsi="Georgia"/>
+          <w:b w:val="0"/>
+          <w:i w:val="0"/>
+          <w:color w:val="141C1E"/>
+          <w:sz w:val="21"/>
+        </w:rPr>
+        <w:t xml:space="preserve"> Left panel: smoothing helps up to about a second of averaging and then starts hurting. That matters — it means there is a real best setting, rather than the measurement simply rewarding more and more blur. Right panel: the error bars. Look at how much they overlap. So the honest reading is not "language beats the alternatives", it is "nothing I added beat plain language". That is a negative result about my own extra machinery.</w:t>
+      </w:r>
+    </w:p>
+    <w:p>
+      <w:pPr>
         <w:spacing w:before="200" w:after="80"/>
         <w:jc w:val="center"/>
       </w:pPr>
@@ -6228,6 +7145,75 @@
           <w:sz w:val="21"/>
         </w:rPr>
         <w:t xml:space="preserve"> detection transfers, adaptation does not — and say so plainly.</w:t>
+      </w:r>
+    </w:p>
+    <w:p>
+      <w:pPr>
+        <w:spacing w:before="120" w:after="120"/>
+        <w:ind w:left="317"/>
+        <w:pBdr>
+          <w:left w:val="single" w:sz="18" w:space="10" w:color="0D6B67"/>
+        </w:pBdr>
+      </w:pPr>
+      <w:r>
+        <w:rPr>
+          <w:rFonts w:ascii="Georgia" w:hAnsi="Georgia"/>
+          <w:b/>
+          <w:i w:val="0"/>
+          <w:color w:val="141C1E"/>
+          <w:sz w:val="21"/>
+        </w:rPr>
+        <w:t>In plain words.</w:t>
+      </w:r>
+      <w:r>
+        <w:rPr>
+          <w:rFonts w:ascii="Georgia" w:hAnsi="Georgia"/>
+          <w:b w:val="0"/>
+          <w:i w:val="0"/>
+          <w:color w:val="141C1E"/>
+          <w:sz w:val="21"/>
+        </w:rPr>
+        <w:t xml:space="preserve"> A result on one dataset is not a result. So I took the system exactly as it stood, changed nothing, retuned nothing, and pointed it at a second benchmark — swapping only the sentence. Two different things happened. The </w:t>
+      </w:r>
+      <w:r>
+        <w:rPr>
+          <w:rFonts w:ascii="Georgia" w:hAnsi="Georgia"/>
+          <w:b w:val="0"/>
+          <w:i/>
+          <w:color w:val="141C1E"/>
+          <w:sz w:val="21"/>
+        </w:rPr>
+        <w:t>detection</w:t>
+      </w:r>
+      <w:r>
+        <w:rPr>
+          <w:rFonts w:ascii="Georgia" w:hAnsi="Georgia"/>
+          <w:b w:val="0"/>
+          <w:i w:val="0"/>
+          <w:color w:val="141C1E"/>
+          <w:sz w:val="21"/>
+        </w:rPr>
+        <w:t xml:space="preserve"> transferred perfectly: 0.706 against 0.707. But the </w:t>
+      </w:r>
+      <w:r>
+        <w:rPr>
+          <w:rFonts w:ascii="Georgia" w:hAnsi="Georgia"/>
+          <w:b w:val="0"/>
+          <w:i/>
+          <w:color w:val="141C1E"/>
+          <w:sz w:val="21"/>
+        </w:rPr>
+        <w:t>adaptation</w:t>
+      </w:r>
+      <w:r>
+        <w:rPr>
+          <w:rFonts w:ascii="Georgia" w:hAnsi="Georgia"/>
+          <w:b w:val="0"/>
+          <w:i w:val="0"/>
+          <w:color w:val="141C1E"/>
+          <w:sz w:val="21"/>
+        </w:rPr>
+        <w:t xml:space="preserve"> almost disappeared, and a meaningless placeholder sentence actually beat an accurate description. I am telling you that myself: whatever the sentence is doing on this second dataset, it is not domain adaptation.</w:t>
       </w:r>
     </w:p>
     <w:p>
@@ -6950,6 +7936,55 @@
       </w:r>
     </w:p>
     <w:p>
+      <w:pPr>
+        <w:spacing w:before="120" w:after="120"/>
+        <w:ind w:left="317"/>
+        <w:pBdr>
+          <w:left w:val="single" w:sz="18" w:space="10" w:color="0D6B67"/>
+        </w:pBdr>
+      </w:pPr>
+      <w:r>
+        <w:rPr>
+          <w:rFonts w:ascii="Georgia" w:hAnsi="Georgia"/>
+          <w:b/>
+          <w:i w:val="0"/>
+          <w:color w:val="141C1E"/>
+          <w:sz w:val="21"/>
+        </w:rPr>
+        <w:t>In plain words.</w:t>
+      </w:r>
+      <w:r>
+        <w:rPr>
+          <w:rFonts w:ascii="Georgia" w:hAnsi="Georgia"/>
+          <w:b w:val="0"/>
+          <w:i w:val="0"/>
+          <w:color w:val="141C1E"/>
+          <w:sz w:val="21"/>
+        </w:rPr>
+        <w:t xml:space="preserve"> I had a comfortable explanation for that — the second dataset has one camera, the first has twelve, and a scene description only earns its keep when there are several places to tell apart. Comfortable explanations for your own bad results deserve suspicion, so I built a test that could have destroyed it. The first dataset is really twelve single-camera datasets stacked together. So I ran the same experiment </w:t>
+      </w:r>
+      <w:r>
+        <w:rPr>
+          <w:rFonts w:ascii="Georgia" w:hAnsi="Georgia"/>
+          <w:b w:val="0"/>
+          <w:i/>
+          <w:color w:val="141C1E"/>
+          <w:sz w:val="21"/>
+        </w:rPr>
+        <w:t>inside</w:t>
+      </w:r>
+      <w:r>
+        <w:rPr>
+          <w:rFonts w:ascii="Georgia" w:hAnsi="Georgia"/>
+          <w:b w:val="0"/>
+          <w:i w:val="0"/>
+          <w:color w:val="141C1E"/>
+          <w:sz w:val="21"/>
+        </w:rPr>
+        <w:t xml:space="preserve"> each camera separately. If my explanation were wrong, the effect would have stayed strong. It dropped to a third, landing right next to the single-camera dataset. The explanation survived a test it could have failed.</w:t>
+      </w:r>
+    </w:p>
+    <w:p>
       <w:r>
         <w:rPr>
           <w:rFonts w:ascii="Georgia" w:hAnsi="Georgia"/>
@@ -7562,6 +8597,35 @@
     </w:p>
     <w:p>
       <w:pPr>
+        <w:spacing w:before="120" w:after="120"/>
+        <w:ind w:left="317"/>
+        <w:pBdr>
+          <w:left w:val="single" w:sz="18" w:space="10" w:color="0D6B67"/>
+        </w:pBdr>
+      </w:pPr>
+      <w:r>
+        <w:rPr>
+          <w:rFonts w:ascii="Georgia" w:hAnsi="Georgia"/>
+          <w:b/>
+          <w:i w:val="0"/>
+          <w:color w:val="141C1E"/>
+          <w:sz w:val="21"/>
+        </w:rPr>
+        <w:t>In plain words.</w:t>
+      </w:r>
+      <w:r>
+        <w:rPr>
+          <w:rFonts w:ascii="Georgia" w:hAnsi="Georgia"/>
+          <w:b w:val="0"/>
+          <w:i w:val="0"/>
+          <w:color w:val="141C1E"/>
+          <w:sz w:val="21"/>
+        </w:rPr>
+        <w:t xml:space="preserve"> That was an average of nine cameras, so here are all nine individually rather than hidden inside a mean. Most fall well below the pooled line, three actually go the wrong way, and two nearly reach it. Each bar rests on as few as five clips. So this is a shift in the average, not a clean collapse everywhere — and I would rather say that than have someone find it.</w:t>
+      </w:r>
+    </w:p>
+    <w:p>
+      <w:pPr>
         <w:spacing w:before="200" w:after="80"/>
         <w:jc w:val="center"/>
       </w:pPr>
@@ -7751,6 +8815,35 @@
           <w:sz w:val="21"/>
         </w:rPr>
         <w:t xml:space="preserve"> negative results as evidence of real work.</w:t>
+      </w:r>
+    </w:p>
+    <w:p>
+      <w:pPr>
+        <w:spacing w:before="120" w:after="120"/>
+        <w:ind w:left="317"/>
+        <w:pBdr>
+          <w:left w:val="single" w:sz="18" w:space="10" w:color="0D6B67"/>
+        </w:pBdr>
+      </w:pPr>
+      <w:r>
+        <w:rPr>
+          <w:rFonts w:ascii="Georgia" w:hAnsi="Georgia"/>
+          <w:b/>
+          <w:i w:val="0"/>
+          <w:color w:val="141C1E"/>
+          <w:sz w:val="21"/>
+        </w:rPr>
+        <w:t>In plain words.</w:t>
+      </w:r>
+      <w:r>
+        <w:rPr>
+          <w:rFonts w:ascii="Georgia" w:hAnsi="Georgia"/>
+          <w:b w:val="0"/>
+          <w:i w:val="0"/>
+          <w:color w:val="141C1E"/>
+          <w:sz w:val="21"/>
+        </w:rPr>
+        <w:t xml:space="preserve"> My claim is that the simplest version of the system is the right one. That claim is only worth anything next to the list of more complicated things I tried first. Six of them, none of which helped. A table of nothing but successes is the easiest thing in the world to produce; six diagnosed failures are not.</w:t>
       </w:r>
     </w:p>
     <w:tbl>
@@ -8280,6 +9373,35 @@
           <w:sz w:val="21"/>
         </w:rPr>
         <w:t xml:space="preserve"> we sit second among training-free methods on ShanghaiTech — and be honest about how much of that margin is the sentence, because most of it is not.</w:t>
+      </w:r>
+    </w:p>
+    <w:p>
+      <w:pPr>
+        <w:spacing w:before="120" w:after="120"/>
+        <w:ind w:left="317"/>
+        <w:pBdr>
+          <w:left w:val="single" w:sz="18" w:space="10" w:color="0D6B67"/>
+        </w:pBdr>
+      </w:pPr>
+      <w:r>
+        <w:rPr>
+          <w:rFonts w:ascii="Georgia" w:hAnsi="Georgia"/>
+          <w:b/>
+          <w:i w:val="0"/>
+          <w:color w:val="141C1E"/>
+          <w:sz w:val="21"/>
+        </w:rPr>
+        <w:t>In plain words.</w:t>
+      </w:r>
+      <w:r>
+        <w:rPr>
+          <w:rFonts w:ascii="Georgia" w:hAnsi="Georgia"/>
+          <w:b w:val="0"/>
+          <w:i w:val="0"/>
+          <w:color w:val="141C1E"/>
+          <w:sz w:val="21"/>
+        </w:rPr>
+        <w:t xml:space="preserve"> Two things to be careful about on this table. First, my own number: I beat the plain CLIP baseline by twelve points, but with no sentence at all I already have ten of those twelve. Most of my margin is careful measurement and a bigger backbone, not language, and I would rather say that than have a panelist open my own table and find it. Second, the method above me is answering a different question. It asks "is the specific thing I named happening?" — so to deploy it you must first list everything that could go wrong. I ask "is anything happening that does not belong here?" — so you describe the ordinary instead. Anyone can describe the ordinary. Nobody can list the extraordinary.</w:t>
       </w:r>
     </w:p>
     <w:p>
@@ -8687,7 +9809,7 @@
                 <w:color w:val="141C1E"/>
                 <w:sz w:val="18"/>
               </w:rPr>
-              <w:t>70.6</w:t>
+              <w:t>67.7</w:t>
             </w:r>
           </w:p>
         </w:tc>
@@ -8797,6 +9919,88 @@
           <w:color w:val="141C1E"/>
           <w:sz w:val="21"/>
         </w:rPr>
+        <w:t>If asked why the Avenue cell is 67.7 when slide 20 showed 0.706:</w:t>
+      </w:r>
+      <w:r>
+        <w:rPr>
+          <w:rFonts w:ascii="Georgia" w:hAnsi="Georgia"/>
+          <w:b w:val="0"/>
+          <w:i w:val="0"/>
+          <w:color w:val="3A4A4C"/>
+          <w:sz w:val="21"/>
+        </w:rPr>
+        <w:t xml:space="preserve"> because this row reports the </w:t>
+      </w:r>
+      <w:r>
+        <w:rPr>
+          <w:rFonts w:ascii="Georgia" w:hAnsi="Georgia"/>
+          <w:b w:val="0"/>
+          <w:i/>
+          <w:color w:val="3A4A4C"/>
+          <w:sz w:val="21"/>
+        </w:rPr>
+        <w:t>matched</w:t>
+      </w:r>
+      <w:r>
+        <w:rPr>
+          <w:rFonts w:ascii="Georgia" w:hAnsi="Georgia"/>
+          <w:b w:val="0"/>
+          <w:i w:val="0"/>
+          <w:color w:val="3A4A4C"/>
+          <w:sz w:val="21"/>
+        </w:rPr>
+        <w:t xml:space="preserve"> condition on both benchmarks — the configuration the method proposes — rather than the best condition on each. Picking </w:t>
+      </w:r>
+      <w:r>
+        <w:rPr>
+          <w:rFonts w:ascii="Consolas" w:hAnsi="Consolas"/>
+          <w:b w:val="0"/>
+          <w:i w:val="0"/>
+          <w:color w:val="3A4A4C"/>
+          <w:sz w:val="20"/>
+        </w:rPr>
+        <w:t>none</w:t>
+      </w:r>
+      <w:r>
+        <w:rPr>
+          <w:rFonts w:ascii="Georgia" w:hAnsi="Georgia"/>
+          <w:b w:val="0"/>
+          <w:i w:val="0"/>
+          <w:color w:val="3A4A4C"/>
+          <w:sz w:val="21"/>
+        </w:rPr>
+        <w:t xml:space="preserve"> for Avenue and </w:t>
+      </w:r>
+      <w:r>
+        <w:rPr>
+          <w:rFonts w:ascii="Consolas" w:hAnsi="Consolas"/>
+          <w:b w:val="0"/>
+          <w:i w:val="0"/>
+          <w:color w:val="3A4A4C"/>
+          <w:sz w:val="20"/>
+        </w:rPr>
+        <w:t>matched</w:t>
+      </w:r>
+      <w:r>
+        <w:rPr>
+          <w:rFonts w:ascii="Georgia" w:hAnsi="Georgia"/>
+          <w:b w:val="0"/>
+          <w:i w:val="0"/>
+          <w:color w:val="3A4A4C"/>
+          <w:sz w:val="21"/>
+        </w:rPr>
+        <w:t xml:space="preserve"> for ShanghaiTech would be quoting a different setup per dataset to flatter the table. Say that plainly; it is a point in your favour, not against you.</w:t>
+      </w:r>
+    </w:p>
+    <w:p>
+      <w:r>
+        <w:rPr>
+          <w:rFonts w:ascii="Georgia" w:hAnsi="Georgia"/>
+          <w:b/>
+          <w:i w:val="0"/>
+          <w:color w:val="141C1E"/>
+          <w:sz w:val="21"/>
+        </w:rPr>
         <w:t>Point at the zero-shot CLIP row first. That is the row that matters.</w:t>
       </w:r>
     </w:p>
@@ -9192,6 +10396,35 @@
     </w:p>
     <w:p>
       <w:pPr>
+        <w:spacing w:before="120" w:after="120"/>
+        <w:ind w:left="317"/>
+        <w:pBdr>
+          <w:left w:val="single" w:sz="18" w:space="10" w:color="0D6B67"/>
+        </w:pBdr>
+      </w:pPr>
+      <w:r>
+        <w:rPr>
+          <w:rFonts w:ascii="Georgia" w:hAnsi="Georgia"/>
+          <w:b/>
+          <w:i w:val="0"/>
+          <w:color w:val="141C1E"/>
+          <w:sz w:val="21"/>
+        </w:rPr>
+        <w:t>In plain words.</w:t>
+      </w:r>
+      <w:r>
+        <w:rPr>
+          <w:rFonts w:ascii="Georgia" w:hAnsi="Georgia"/>
+          <w:b w:val="0"/>
+          <w:i w:val="0"/>
+          <w:color w:val="141C1E"/>
+          <w:sz w:val="21"/>
+        </w:rPr>
+        <w:t xml:space="preserve"> These are limitations I found and am choosing to put on a slide, not ones the panel had to dig out. The third one is worth dwelling on, because it is not really about my system: the scoring procedure that this whole field uses turns out to be sensitive to a rescaling of the score that ought not to matter at all. I found it while chasing my own bug, and it applies to everybody's numbers, not just mine.</w:t>
+      </w:r>
+    </w:p>
+    <w:p>
+      <w:pPr>
         <w:pStyle w:val="ListBullet"/>
         <w:spacing w:after="60"/>
       </w:pPr>
@@ -9519,6 +10752,35 @@
       </w:r>
     </w:p>
     <w:p>
+      <w:pPr>
+        <w:spacing w:before="120" w:after="120"/>
+        <w:ind w:left="317"/>
+        <w:pBdr>
+          <w:left w:val="single" w:sz="18" w:space="10" w:color="0D6B67"/>
+        </w:pBdr>
+      </w:pPr>
+      <w:r>
+        <w:rPr>
+          <w:rFonts w:ascii="Georgia" w:hAnsi="Georgia"/>
+          <w:b/>
+          <w:i w:val="0"/>
+          <w:color w:val="141C1E"/>
+          <w:sz w:val="21"/>
+        </w:rPr>
+        <w:t>In plain words.</w:t>
+      </w:r>
+      <w:r>
+        <w:rPr>
+          <w:rFonts w:ascii="Georgia" w:hAnsi="Georgia"/>
+          <w:b w:val="0"/>
+          <w:i w:val="0"/>
+          <w:color w:val="141C1E"/>
+          <w:sz w:val="21"/>
+        </w:rPr>
+        <w:t xml:space="preserve"> Each limitation maps to a specific next experiment, and they are ordered by how much they would change the conclusions. The practical point is that the expensive part is now behind me: encoding a benchmark takes twenty-one minutes once, after which testing a new idea against it takes seconds instead of the fifty minutes each of these early runs cost.</w:t>
+      </w:r>
+    </w:p>
+    <w:p>
       <w:r>
         <w:rPr>
           <w:rFonts w:ascii="Georgia" w:hAnsi="Georgia"/>
@@ -9674,6 +10936,35 @@
           <w:sz w:val="21"/>
         </w:rPr>
         <w:t xml:space="preserve"> close on the boundary, not the number.</w:t>
+      </w:r>
+    </w:p>
+    <w:p>
+      <w:pPr>
+        <w:spacing w:before="120" w:after="120"/>
+        <w:ind w:left="317"/>
+        <w:pBdr>
+          <w:left w:val="single" w:sz="18" w:space="10" w:color="0D6B67"/>
+        </w:pBdr>
+      </w:pPr>
+      <w:r>
+        <w:rPr>
+          <w:rFonts w:ascii="Georgia" w:hAnsi="Georgia"/>
+          <w:b/>
+          <w:i w:val="0"/>
+          <w:color w:val="141C1E"/>
+          <w:sz w:val="21"/>
+        </w:rPr>
+        <w:t>In plain words.</w:t>
+      </w:r>
+      <w:r>
+        <w:rPr>
+          <w:rFonts w:ascii="Georgia" w:hAnsi="Georgia"/>
+          <w:b w:val="0"/>
+          <w:i w:val="0"/>
+          <w:color w:val="141C1E"/>
+          <w:sz w:val="21"/>
+        </w:rPr>
+        <w:t xml:space="preserve"> One line each. What I want to leave you with is not the headline number — it is the boundary. I can tell you where this works, where it does not, and which single experiment settles the part I am unsure about. And every figure here comes out of committed code with a run record attached.</w:t>
       </w:r>
     </w:p>
     <w:p>

</xml_diff>